<commit_message>
Focus beta messaging on IT jobseekers and collect pricing feedback
</commit_message>
<xml_diff>
--- a/docs/launch/rolebridge-tester-questionnaire.docx
+++ b/docs/launch/rolebridge-tester-questionnaire.docx
@@ -12,7 +12,7 @@
     </w:p>
     <w:p>
       <w:r>
-        <w:t>Thanks for trying RoleBridge. These seven questions take about 2–3 minutes and will help us improve the job-search journey. Please answer based on what you actually tried; it's useful to hear where something didn't work.</w:t>
+        <w:t>Thanks for trying RoleBridge. These eight questions take about 3 minutes and will help us improve the job-search journey. Please answer based on what you actually tried; it's useful to hear where something didn't work.</w:t>
       </w:r>
     </w:p>
     <w:p>
@@ -259,6 +259,46 @@
       </w:r>
     </w:p>
     <w:p/>
+    <w:p>
+      <w:r>
+        <w:t>8. Would you be willing to pay for RoleBridge in the future to help with your job search? If so, how much per month?</w:t>
+      </w:r>
+    </w:p>
+    <w:p>
+      <w:r>
+        <w:t>Choose one answer based on what you tried. The beta is free. This is research only, not a subscription or a commitment to pay.</w:t>
+      </w:r>
+    </w:p>
+    <w:p>
+      <w:r>
+        <w:t>A. £4.99 per month</w:t>
+      </w:r>
+    </w:p>
+    <w:p>
+      <w:r>
+        <w:t>B. £7.99 per month</w:t>
+      </w:r>
+    </w:p>
+    <w:p>
+      <w:r>
+        <w:t>C. £9.99 per month</w:t>
+      </w:r>
+    </w:p>
+    <w:p>
+      <w:r>
+        <w:t>D. It’s worth more — over £9.99 per month</w:t>
+      </w:r>
+    </w:p>
+    <w:p>
+      <w:r>
+        <w:t>E. I wouldn’t pay for this service</w:t>
+      </w:r>
+    </w:p>
+    <w:p>
+      <w:r>
+        <w:t>F. Not sure yet</w:t>
+      </w:r>
+    </w:p>
     <w:sectPr>
       <w:pgSz w:w="12240" w:h="15840"/>
       <w:pgMar w:top="936" w:right="1008" w:bottom="936" w:left="1008" w:header="720" w:footer="720" w:gutter="0"/>

</xml_diff>